<commit_message>
Add /join-me, qwenloop, and vibey-gh; regenerate all formats
- Contact line links hire.adam.matthewsteinberger.com/join-me — the page
  with everything a developer needs to get started contributing.
- Open source lists qwenloop (fully local Qwen 2.5 Coder runner) and
  vibey-gh (stdlib-only release automation); packages are named, never
  counted, matching the site's house rule.
- OSS note now invites contributors and volunteers via /join-me.
- README, TXT, DOCX (python-docx), and PDF (headless Chromium print of the
  HTML) regenerated from tools/build_resume.py.

Co-Authored-By: Claude Fable 5 <noreply@anthropic.com>
</commit_message>
<xml_diff>
--- a/adam-steinberger-resume.docx
+++ b/adam-steinberger-resume.docx
@@ -92,6 +92,18 @@
             <w:u w:val="single"/>
           </w:rPr>
           <w:t>hire.adam.matthewsteinberger.com</w:t>
+        </w:r>
+      </w:hyperlink>
+      <w:r>
+        <w:t xml:space="preserve">  ·  </w:t>
+      </w:r>
+      <w:hyperlink r:id="rId14">
+        <w:r>
+          <w:rPr>
+            <w:color w:val="0969DA"/>
+            <w:u w:val="single"/>
+          </w:rPr>
+          <w:t>hire.adam.matthewsteinberger.com/join-me</w:t>
         </w:r>
       </w:hyperlink>
     </w:p>
@@ -1313,7 +1325,7 @@
         <w:pStyle w:val="ListBullet"/>
         <w:spacing w:after="30"/>
       </w:pPr>
-      <w:hyperlink r:id="rId14">
+      <w:hyperlink r:id="rId15">
         <w:r>
           <w:rPr>
             <w:color w:val="0969DA"/>
@@ -1325,7 +1337,7 @@
       <w:r>
         <w:t xml:space="preserve"> · </w:t>
       </w:r>
-      <w:hyperlink r:id="rId15">
+      <w:hyperlink r:id="rId16">
         <w:r>
           <w:rPr>
             <w:color w:val="0969DA"/>
@@ -1337,7 +1349,7 @@
       <w:r>
         <w:t xml:space="preserve"> · </w:t>
       </w:r>
-      <w:hyperlink r:id="rId16">
+      <w:hyperlink r:id="rId17">
         <w:r>
           <w:rPr>
             <w:color w:val="0969DA"/>
@@ -1349,7 +1361,7 @@
       <w:r>
         <w:t xml:space="preserve"> · </w:t>
       </w:r>
-      <w:hyperlink r:id="rId17">
+      <w:hyperlink r:id="rId18">
         <w:r>
           <w:rPr>
             <w:color w:val="0969DA"/>
@@ -1361,7 +1373,19 @@
       <w:r>
         <w:t xml:space="preserve"> · </w:t>
       </w:r>
-      <w:hyperlink r:id="rId18">
+      <w:hyperlink r:id="rId19">
+        <w:r>
+          <w:rPr>
+            <w:color w:val="0969DA"/>
+            <w:u w:val="single"/>
+          </w:rPr>
+          <w:t>qwenloop</w:t>
+        </w:r>
+      </w:hyperlink>
+      <w:r>
+        <w:t xml:space="preserve"> · </w:t>
+      </w:r>
+      <w:hyperlink r:id="rId20">
         <w:r>
           <w:rPr>
             <w:color w:val="0969DA"/>
@@ -1371,10 +1395,22 @@
         </w:r>
       </w:hyperlink>
       <w:r>
+        <w:t xml:space="preserve"> · </w:t>
+      </w:r>
+      <w:hyperlink r:id="rId21">
+        <w:r>
+          <w:rPr>
+            <w:color w:val="0969DA"/>
+            <w:u w:val="single"/>
+          </w:rPr>
+          <w:t>vibey-gh</w:t>
+        </w:r>
+      </w:hyperlink>
+      <w:r>
         <w:t xml:space="preserve"> — </w:t>
       </w:r>
       <w:r>
-        <w:t xml:space="preserve">Onion-architected autonomous session runners for Claude Code, OpenAI Codex, Cursor Agent, and Google Antigravity </w:t>
+        <w:t xml:space="preserve">Onion-architected autonomous session runners for Claude Code, OpenAI Codex, Cursor Agent, Google Antigravity, and a fully local Qwen 2.5 Coder </w:t>
       </w:r>
       <w:r>
         <w:rPr>
@@ -1384,7 +1420,7 @@
         <w:t>(never block on a human; distinguish rate-limit windows from exhausted credits)</w:t>
       </w:r>
       <w:r>
-        <w:t xml:space="preserve"> and </w:t>
+        <w:t xml:space="preserve">; </w:t>
       </w:r>
       <w:r>
         <w:rPr>
@@ -1393,7 +1429,16 @@
         <w:t>vibey</w:t>
       </w:r>
       <w:r>
-        <w:t>, the six-phase PostgreSQL-backed conductor on top of them.</w:t>
+        <w:t xml:space="preserve">, the six-phase PostgreSQL-backed conductor on top of them; and </w:t>
+      </w:r>
+      <w:r>
+        <w:rPr>
+          <w:b/>
+        </w:rPr>
+        <w:t>vibey-gh</w:t>
+      </w:r>
+      <w:r>
+        <w:t>, stdlib-only release automation (provenance, merge train, dual-channel releases).</w:t>
       </w:r>
     </w:p>
     <w:p>
@@ -1401,7 +1446,7 @@
         <w:pStyle w:val="ListBullet"/>
         <w:spacing w:after="30"/>
       </w:pPr>
-      <w:hyperlink r:id="rId19">
+      <w:hyperlink r:id="rId22">
         <w:r>
           <w:rPr>
             <w:color w:val="0969DA"/>
@@ -1413,7 +1458,7 @@
       <w:r>
         <w:t xml:space="preserve"> · </w:t>
       </w:r>
-      <w:hyperlink r:id="rId20">
+      <w:hyperlink r:id="rId23">
         <w:r>
           <w:rPr>
             <w:color w:val="0969DA"/>
@@ -1436,16 +1481,7 @@
         <w:t>(formerly azure-bootstrap; 17+ repos)</w:t>
       </w:r>
       <w:r>
-        <w:t xml:space="preserve"> and an </w:t>
-      </w:r>
-      <w:r>
-        <w:rPr>
-          <w:b/>
-        </w:rPr>
-        <w:t>18-plugin / 71-skill</w:t>
-      </w:r>
-      <w:r>
-        <w:t xml:space="preserve"> Claude Code marketplace </w:t>
+        <w:t xml:space="preserve"> and a Claude Code marketplace of evidence-grounded practitioner skills </w:t>
       </w:r>
       <w:r>
         <w:rPr>
@@ -1460,15 +1496,15 @@
     </w:p>
     <w:p>
       <w:r>
-        <w:t xml:space="preserve">All MIT-licensed, on PyPI — </w:t>
+        <w:t xml:space="preserve">All MIT-licensed, on PyPI. Contributors and volunteers welcome — </w:t>
       </w:r>
-      <w:hyperlink r:id="rId21">
+      <w:hyperlink r:id="rId14">
         <w:r>
           <w:rPr>
             <w:color w:val="0969DA"/>
             <w:u w:val="single"/>
           </w:rPr>
-          <w:t>hire.adam.matthewsteinberger.com/open-source</w:t>
+          <w:t>hire.adam.matthewsteinberger.com/join-me</w:t>
         </w:r>
       </w:hyperlink>
     </w:p>
@@ -1493,7 +1529,7 @@
         <w:pStyle w:val="ListBullet"/>
         <w:spacing w:after="30"/>
       </w:pPr>
-      <w:hyperlink r:id="rId22">
+      <w:hyperlink r:id="rId24">
         <w:r>
           <w:rPr>
             <w:color w:val="0969DA"/>

</xml_diff>

<commit_message>
Point site and chat links at the new vibe.with / chat.with hosts; regenerate
</commit_message>
<xml_diff>
--- a/adam-steinberger-resume.docx
+++ b/adam-steinberger-resume.docx
@@ -91,7 +91,7 @@
             <w:color w:val="0969DA"/>
             <w:u w:val="single"/>
           </w:rPr>
-          <w:t>hire.adam.matthewsteinberger.com</w:t>
+          <w:t>vibe.with.adam.matthewsteinberger.com</w:t>
         </w:r>
       </w:hyperlink>
       <w:r>
@@ -103,7 +103,7 @@
             <w:color w:val="0969DA"/>
             <w:u w:val="single"/>
           </w:rPr>
-          <w:t>hire.adam.matthewsteinberger.com/join-me</w:t>
+          <w:t>vibe.with.adam.matthewsteinberger.com/join-me</w:t>
         </w:r>
       </w:hyperlink>
     </w:p>
@@ -1504,7 +1504,7 @@
             <w:color w:val="0969DA"/>
             <w:u w:val="single"/>
           </w:rPr>
-          <w:t>hire.adam.matthewsteinberger.com/join-me</w:t>
+          <w:t>vibe.with.adam.matthewsteinberger.com/join-me</w:t>
         </w:r>
       </w:hyperlink>
     </w:p>

</xml_diff>

<commit_message>
vibewithadam / chatwithadam host names; regenerate
</commit_message>
<xml_diff>
--- a/adam-steinberger-resume.docx
+++ b/adam-steinberger-resume.docx
@@ -91,7 +91,7 @@
             <w:color w:val="0969DA"/>
             <w:u w:val="single"/>
           </w:rPr>
-          <w:t>vibe.with.adam.matthewsteinberger.com</w:t>
+          <w:t>vibewithadam.matthewsteinberger.com</w:t>
         </w:r>
       </w:hyperlink>
       <w:r>
@@ -103,7 +103,7 @@
             <w:color w:val="0969DA"/>
             <w:u w:val="single"/>
           </w:rPr>
-          <w:t>vibe.with.adam.matthewsteinberger.com/join-me</w:t>
+          <w:t>vibewithadam.matthewsteinberger.com/join-me</w:t>
         </w:r>
       </w:hyperlink>
     </w:p>
@@ -1504,7 +1504,7 @@
             <w:color w:val="0969DA"/>
             <w:u w:val="single"/>
           </w:rPr>
-          <w:t>vibe.with.adam.matthewsteinberger.com/join-me</w:t>
+          <w:t>vibewithadam.matthewsteinberger.com/join-me</w:t>
         </w:r>
       </w:hyperlink>
     </w:p>

</xml_diff>